<commit_message>
Diseño de la etapa 1: diagrama de clases, secuencia del rebote y documento técnico
- Manual: regla de rebote al azar y en cadena coherente en todo el texto.
- Diagrama de clases simplificado que cubre los temas de la guía (Unidades 1 a 5).
- Diagrama de secuencia del disparo con rebote en cadena.
- Documento técnico: responsabilidades, reglas, temas de la guía, GRASP/SOLID y pendientes.

Co-Authored-By: Claude Opus 5.5 <noreply@anthropic.com>
Claude-Session: https://claude.ai/code/session_01YcNnhzVZgkJypRptvKEgbn
</commit_message>
<xml_diff>
--- a/TPO/Manual_Batalla_Naval_con_Trampolines.docx
+++ b/TPO/Manual_Batalla_Naval_con_Trampolines.docx
@@ -73,72 +73,8 @@
         <w:rPr>
           <w:color w:val="5B6770"/>
         </w:rPr>
-        <w:t xml:space="preserve">Santiago </w:t>
-      </w:r>
-      <w:proofErr w:type="spellStart"/>
-      <w:r>
-        <w:rPr>
-          <w:color w:val="5B6770"/>
-        </w:rPr>
-        <w:t>Terminiello</w:t>
-      </w:r>
-      <w:proofErr w:type="spellEnd"/>
-      <w:r>
-        <w:rPr>
-          <w:color w:val="5B6770"/>
-        </w:rPr>
-        <w:t xml:space="preserve">, Nahuel </w:t>
-      </w:r>
-      <w:proofErr w:type="spellStart"/>
-      <w:r>
-        <w:rPr>
-          <w:color w:val="5B6770"/>
-        </w:rPr>
-        <w:t>Mioni</w:t>
-      </w:r>
-      <w:proofErr w:type="spellEnd"/>
-      <w:r>
-        <w:rPr>
-          <w:color w:val="5B6770"/>
-        </w:rPr>
-        <w:t xml:space="preserve">, Emanuel </w:t>
-      </w:r>
-      <w:proofErr w:type="spellStart"/>
-      <w:r>
-        <w:rPr>
-          <w:color w:val="5B6770"/>
-        </w:rPr>
-        <w:t>Paoloni</w:t>
-      </w:r>
-      <w:proofErr w:type="spellEnd"/>
-      <w:r>
-        <w:rPr>
-          <w:color w:val="5B6770"/>
-        </w:rPr>
-        <w:t xml:space="preserve">, Matias Llanos y </w:t>
-      </w:r>
-      <w:proofErr w:type="spellStart"/>
-      <w:r>
-        <w:rPr>
-          <w:color w:val="5B6770"/>
-        </w:rPr>
-        <w:t>Joaquin</w:t>
-      </w:r>
-      <w:proofErr w:type="spellEnd"/>
-      <w:r>
-        <w:rPr>
-          <w:color w:val="5B6770"/>
-        </w:rPr>
-        <w:t xml:space="preserve"> </w:t>
-      </w:r>
-      <w:proofErr w:type="spellStart"/>
-      <w:r>
-        <w:rPr>
-          <w:color w:val="5B6770"/>
-        </w:rPr>
-        <w:t>Valdettaro</w:t>
-      </w:r>
-      <w:proofErr w:type="spellEnd"/>
+        <w:t xml:space="preserve">Santiago Terminiello, Nahuel Mioni, Emanuel Paoloni, Matias Llanos y Joaquin Valdettaro</w:t>
+      </w:r>
     </w:p>
     <w:p>
       <w:pPr>
@@ -654,15 +590,7 @@
         <w:t>A</w:t>
       </w:r>
       <w:r>
-        <w:t xml:space="preserve"> </w:t>
-      </w:r>
-      <w:proofErr w:type="spellStart"/>
-      <w:r>
-        <w:t>a</w:t>
-      </w:r>
-      <w:proofErr w:type="spellEnd"/>
-      <w:r>
-        <w:t xml:space="preserve"> la </w:t>
+        <w:t xml:space="preserve"> a la </w:t>
       </w:r>
       <w:r>
         <w:rPr>
@@ -839,15 +767,7 @@
         <w:spacing w:after="80"/>
       </w:pPr>
       <w:r>
-        <w:t xml:space="preserve">Escribís la casilla del tablero rival donde </w:t>
-      </w:r>
-      <w:proofErr w:type="spellStart"/>
-      <w:r>
-        <w:t>tirás</w:t>
-      </w:r>
-      <w:proofErr w:type="spellEnd"/>
-      <w:r>
-        <w:t xml:space="preserve"> la bomba.</w:t>
+        <w:t xml:space="preserve">Escribís la casilla del tablero rival donde tirás la bomba.</w:t>
       </w:r>
     </w:p>
     <w:p>
@@ -913,7 +833,7 @@
         <w:spacing w:after="80"/>
       </w:pPr>
       <w:r>
-        <w:t>Si fue trampolín, la bomba cae en tu propio tablero, en la misma casilla, y el juego te dice qué pasó ahí.</w:t>
+        <w:t>Si fue trampolín, la bomba cae en tu propio tablero, en una casilla al azar donde todavía no haya caído ninguna bomba, y el juego te dice dónde cayó y qué pasó ahí. Si ahí hay un trampolín tuyo, la bomba vuelve a rebotar (ver la regla 10).</w:t>
       </w:r>
     </w:p>
     <w:p>
@@ -925,21 +845,8 @@
         </w:numPr>
         <w:spacing w:after="80"/>
       </w:pPr>
-      <w:proofErr w:type="spellStart"/>
-      <w:r>
-        <w:t>Presionás</w:t>
-      </w:r>
-      <w:proofErr w:type="spellEnd"/>
-      <w:r>
-        <w:t xml:space="preserve"> </w:t>
-      </w:r>
-      <w:proofErr w:type="spellStart"/>
-      <w:r>
-        <w:t>Enter</w:t>
-      </w:r>
-      <w:proofErr w:type="spellEnd"/>
-      <w:r>
-        <w:t>, se limpia la pantalla y le toca al otro jugador.</w:t>
+      <w:r>
+        <w:t xml:space="preserve">Presionás Enter, se limpia la pantalla y le toca al otro jugador.</w:t>
       </w:r>
     </w:p>
     <w:p>
@@ -1125,13 +1032,8 @@
           </w:tcPr>
           <w:p>
             <w:r>
-              <w:t xml:space="preserve">Agua, o una casilla que todavía no </w:t>
+              <w:t xml:space="preserve">Agua, o una casilla que todavía no conocés</w:t>
             </w:r>
-            <w:proofErr w:type="spellStart"/>
-            <w:r>
-              <w:t>conocés</w:t>
-            </w:r>
-            <w:proofErr w:type="spellEnd"/>
           </w:p>
         </w:tc>
         <w:tc>
@@ -1635,25 +1537,7 @@
           <w:sz w:val="17"/>
           <w:szCs w:val="17"/>
         </w:rPr>
-        <w:t xml:space="preserve">TU TABLERO                 </w:t>
-      </w:r>
-      <w:proofErr w:type="spellStart"/>
-      <w:r>
-        <w:rPr>
-          <w:rFonts w:ascii="Consolas" w:eastAsia="Consolas" w:hAnsi="Consolas" w:cs="Consolas"/>
-          <w:sz w:val="17"/>
-          <w:szCs w:val="17"/>
-        </w:rPr>
-        <w:t>TABLERO</w:t>
-      </w:r>
-      <w:proofErr w:type="spellEnd"/>
-      <w:r>
-        <w:rPr>
-          <w:rFonts w:ascii="Consolas" w:eastAsia="Consolas" w:hAnsi="Consolas" w:cs="Consolas"/>
-          <w:sz w:val="17"/>
-          <w:szCs w:val="17"/>
-        </w:rPr>
-        <w:t xml:space="preserve"> DE MARTINA</w:t>
+        <w:t xml:space="preserve">TU TABLERO                 TABLERO DE MARTINA</w:t>
       </w:r>
     </w:p>
     <w:p>
@@ -1687,41 +1571,13 @@
         <w:spacing w:line="240" w:lineRule="auto"/>
         <w:ind w:left="200"/>
       </w:pPr>
-      <w:proofErr w:type="gramStart"/>
       <w:r>
         <w:rPr>
           <w:rFonts w:ascii="Consolas" w:eastAsia="Consolas" w:hAnsi="Consolas" w:cs="Consolas"/>
           <w:sz w:val="17"/>
           <w:szCs w:val="17"/>
         </w:rPr>
-        <w:t>A  ~</w:t>
-      </w:r>
-      <w:proofErr w:type="gramEnd"/>
-      <w:r>
-        <w:rPr>
-          <w:rFonts w:ascii="Consolas" w:eastAsia="Consolas" w:hAnsi="Consolas" w:cs="Consolas"/>
-          <w:sz w:val="17"/>
-          <w:szCs w:val="17"/>
-        </w:rPr>
-        <w:t xml:space="preserve"> B X B </w:t>
-      </w:r>
-      <w:proofErr w:type="spellStart"/>
-      <w:r>
-        <w:rPr>
-          <w:rFonts w:ascii="Consolas" w:eastAsia="Consolas" w:hAnsi="Consolas" w:cs="Consolas"/>
-          <w:sz w:val="17"/>
-          <w:szCs w:val="17"/>
-        </w:rPr>
-        <w:t>B</w:t>
-      </w:r>
-      <w:proofErr w:type="spellEnd"/>
-      <w:r>
-        <w:rPr>
-          <w:rFonts w:ascii="Consolas" w:eastAsia="Consolas" w:hAnsi="Consolas" w:cs="Consolas"/>
-          <w:sz w:val="17"/>
-          <w:szCs w:val="17"/>
-        </w:rPr>
-        <w:t xml:space="preserve"> ~ ~ ~ ~ ~     A  ~ ~ ~ ~ ~ ~ ~ ~ ~ ~</w:t>
+        <w:t xml:space="preserve">A  ~ B X B B ~ ~ ~ ~ ~     A  ~ ~ ~ ~ ~ ~ ~ ~ ~ ~</w:t>
       </w:r>
     </w:p>
     <w:p>
@@ -1735,41 +1591,13 @@
         <w:spacing w:line="240" w:lineRule="auto"/>
         <w:ind w:left="200"/>
       </w:pPr>
-      <w:proofErr w:type="gramStart"/>
       <w:r>
         <w:rPr>
           <w:rFonts w:ascii="Consolas" w:eastAsia="Consolas" w:hAnsi="Consolas" w:cs="Consolas"/>
           <w:sz w:val="17"/>
           <w:szCs w:val="17"/>
         </w:rPr>
-        <w:t>B  ~</w:t>
-      </w:r>
-      <w:proofErr w:type="gramEnd"/>
-      <w:r>
-        <w:rPr>
-          <w:rFonts w:ascii="Consolas" w:eastAsia="Consolas" w:hAnsi="Consolas" w:cs="Consolas"/>
-          <w:sz w:val="17"/>
-          <w:szCs w:val="17"/>
-        </w:rPr>
-        <w:t xml:space="preserve"> ~ ~ ~ ~ ~ ~ ~ T ~     B  ~ X </w:t>
-      </w:r>
-      <w:proofErr w:type="spellStart"/>
-      <w:r>
-        <w:rPr>
-          <w:rFonts w:ascii="Consolas" w:eastAsia="Consolas" w:hAnsi="Consolas" w:cs="Consolas"/>
-          <w:sz w:val="17"/>
-          <w:szCs w:val="17"/>
-        </w:rPr>
-        <w:t>X</w:t>
-      </w:r>
-      <w:proofErr w:type="spellEnd"/>
-      <w:r>
-        <w:rPr>
-          <w:rFonts w:ascii="Consolas" w:eastAsia="Consolas" w:hAnsi="Consolas" w:cs="Consolas"/>
-          <w:sz w:val="17"/>
-          <w:szCs w:val="17"/>
-        </w:rPr>
-        <w:t xml:space="preserve"> ~ ~ ~ ~ ~ ~ ~</w:t>
+        <w:t xml:space="preserve">B  ~ ~ ~ ~ ~ ~ ~ ~ T ~     B  ~ X X ~ ~ ~ ~ ~ ~ ~</w:t>
       </w:r>
     </w:p>
     <w:p>
@@ -1783,23 +1611,13 @@
         <w:spacing w:line="240" w:lineRule="auto"/>
         <w:ind w:left="200"/>
       </w:pPr>
-      <w:proofErr w:type="gramStart"/>
       <w:r>
         <w:rPr>
           <w:rFonts w:ascii="Consolas" w:eastAsia="Consolas" w:hAnsi="Consolas" w:cs="Consolas"/>
           <w:sz w:val="17"/>
           <w:szCs w:val="17"/>
         </w:rPr>
-        <w:t>C  ~</w:t>
-      </w:r>
-      <w:proofErr w:type="gramEnd"/>
-      <w:r>
-        <w:rPr>
-          <w:rFonts w:ascii="Consolas" w:eastAsia="Consolas" w:hAnsi="Consolas" w:cs="Consolas"/>
-          <w:sz w:val="17"/>
-          <w:szCs w:val="17"/>
-        </w:rPr>
-        <w:t xml:space="preserve"> ~ ~ ~ ~ ~ ~ B ~ ~     C  ~ ~ ~ ~ ~ ~ ~ ~ ~ ~</w:t>
+        <w:t xml:space="preserve">C  ~ ~ ~ ~ ~ ~ ~ B ~ ~     C  ~ ~ ~ ~ ~ ~ ~ ~ ~ ~</w:t>
       </w:r>
     </w:p>
     <w:p>
@@ -1813,23 +1631,13 @@
         <w:spacing w:line="240" w:lineRule="auto"/>
         <w:ind w:left="200"/>
       </w:pPr>
-      <w:proofErr w:type="gramStart"/>
       <w:r>
         <w:rPr>
           <w:rFonts w:ascii="Consolas" w:eastAsia="Consolas" w:hAnsi="Consolas" w:cs="Consolas"/>
           <w:sz w:val="17"/>
           <w:szCs w:val="17"/>
         </w:rPr>
-        <w:t>D  ~</w:t>
-      </w:r>
-      <w:proofErr w:type="gramEnd"/>
-      <w:r>
-        <w:rPr>
-          <w:rFonts w:ascii="Consolas" w:eastAsia="Consolas" w:hAnsi="Consolas" w:cs="Consolas"/>
-          <w:sz w:val="17"/>
-          <w:szCs w:val="17"/>
-        </w:rPr>
-        <w:t xml:space="preserve"> ~ ~ ~ ~ ~ ~ B ~ ~     D  ~ ~ ~ O ~ ~ ~ ~ ~ ~</w:t>
+        <w:t xml:space="preserve">D  ~ ~ ~ ~ ~ ~ ~ B ~ ~     D  ~ ~ ~ O ~ ~ ~ ~ ~ ~</w:t>
       </w:r>
     </w:p>
     <w:p>
@@ -1843,23 +1651,13 @@
         <w:spacing w:line="240" w:lineRule="auto"/>
         <w:ind w:left="200"/>
       </w:pPr>
-      <w:proofErr w:type="gramStart"/>
       <w:r>
         <w:rPr>
           <w:rFonts w:ascii="Consolas" w:eastAsia="Consolas" w:hAnsi="Consolas" w:cs="Consolas"/>
           <w:sz w:val="17"/>
           <w:szCs w:val="17"/>
         </w:rPr>
-        <w:t>E  ~</w:t>
-      </w:r>
-      <w:proofErr w:type="gramEnd"/>
-      <w:r>
-        <w:rPr>
-          <w:rFonts w:ascii="Consolas" w:eastAsia="Consolas" w:hAnsi="Consolas" w:cs="Consolas"/>
-          <w:sz w:val="17"/>
-          <w:szCs w:val="17"/>
-        </w:rPr>
-        <w:t xml:space="preserve"> ~ R ~ ~ ~ ~ B ~ ~     E  ~ ~ ~ ~ ~ ~ ~ ~ ~ ~</w:t>
+        <w:t xml:space="preserve">E  ~ ~ R ~ ~ ~ ~ B ~ ~     E  ~ ~ ~ ~ ~ ~ ~ ~ ~ ~</w:t>
       </w:r>
     </w:p>
     <w:p>
@@ -1873,23 +1671,13 @@
         <w:spacing w:line="240" w:lineRule="auto"/>
         <w:ind w:left="200"/>
       </w:pPr>
-      <w:proofErr w:type="gramStart"/>
       <w:r>
         <w:rPr>
           <w:rFonts w:ascii="Consolas" w:eastAsia="Consolas" w:hAnsi="Consolas" w:cs="Consolas"/>
           <w:sz w:val="17"/>
           <w:szCs w:val="17"/>
         </w:rPr>
-        <w:t>F  ~</w:t>
-      </w:r>
-      <w:proofErr w:type="gramEnd"/>
-      <w:r>
-        <w:rPr>
-          <w:rFonts w:ascii="Consolas" w:eastAsia="Consolas" w:hAnsi="Consolas" w:cs="Consolas"/>
-          <w:sz w:val="17"/>
-          <w:szCs w:val="17"/>
-        </w:rPr>
-        <w:t xml:space="preserve"> ~ ~ ~ ~ O ~ ~ ~ ~     F  ~ ~ ~ ~ ~ ~ ~ ~ R ~</w:t>
+        <w:t xml:space="preserve">F  ~ ~ ~ ~ ~ O ~ ~ ~ ~     F  ~ ~ ~ ~ ~ ~ ~ ~ R ~</w:t>
       </w:r>
     </w:p>
     <w:p>
@@ -1903,41 +1691,13 @@
         <w:spacing w:line="240" w:lineRule="auto"/>
         <w:ind w:left="200"/>
       </w:pPr>
-      <w:proofErr w:type="gramStart"/>
       <w:r>
         <w:rPr>
           <w:rFonts w:ascii="Consolas" w:eastAsia="Consolas" w:hAnsi="Consolas" w:cs="Consolas"/>
           <w:sz w:val="17"/>
           <w:szCs w:val="17"/>
         </w:rPr>
-        <w:t>G  B</w:t>
-      </w:r>
-      <w:proofErr w:type="gramEnd"/>
-      <w:r>
-        <w:rPr>
-          <w:rFonts w:ascii="Consolas" w:eastAsia="Consolas" w:hAnsi="Consolas" w:cs="Consolas"/>
-          <w:sz w:val="17"/>
-          <w:szCs w:val="17"/>
-        </w:rPr>
-        <w:t xml:space="preserve"> </w:t>
-      </w:r>
-      <w:proofErr w:type="spellStart"/>
-      <w:r>
-        <w:rPr>
-          <w:rFonts w:ascii="Consolas" w:eastAsia="Consolas" w:hAnsi="Consolas" w:cs="Consolas"/>
-          <w:sz w:val="17"/>
-          <w:szCs w:val="17"/>
-        </w:rPr>
-        <w:t>B</w:t>
-      </w:r>
-      <w:proofErr w:type="spellEnd"/>
-      <w:r>
-        <w:rPr>
-          <w:rFonts w:ascii="Consolas" w:eastAsia="Consolas" w:hAnsi="Consolas" w:cs="Consolas"/>
-          <w:sz w:val="17"/>
-          <w:szCs w:val="17"/>
-        </w:rPr>
-        <w:t xml:space="preserve"> ~ ~ ~ ~ ~ ~ ~ ~     G  ~ ~ ~ ~ ~ ~ ~ ~ ~ ~</w:t>
+        <w:t xml:space="preserve">G  B B ~ ~ ~ ~ ~ ~ ~ ~     G  ~ ~ ~ ~ ~ ~ ~ ~ ~ ~</w:t>
       </w:r>
     </w:p>
     <w:p>
@@ -1951,23 +1711,13 @@
         <w:spacing w:line="240" w:lineRule="auto"/>
         <w:ind w:left="200"/>
       </w:pPr>
-      <w:proofErr w:type="gramStart"/>
       <w:r>
         <w:rPr>
           <w:rFonts w:ascii="Consolas" w:eastAsia="Consolas" w:hAnsi="Consolas" w:cs="Consolas"/>
           <w:sz w:val="17"/>
           <w:szCs w:val="17"/>
         </w:rPr>
-        <w:t>H  ~</w:t>
-      </w:r>
-      <w:proofErr w:type="gramEnd"/>
-      <w:r>
-        <w:rPr>
-          <w:rFonts w:ascii="Consolas" w:eastAsia="Consolas" w:hAnsi="Consolas" w:cs="Consolas"/>
-          <w:sz w:val="17"/>
-          <w:szCs w:val="17"/>
-        </w:rPr>
-        <w:t xml:space="preserve"> ~ ~ ~ T ~ ~ ~ ~ ~     H  ~ ~ ~ ~ ~ ~ O ~ ~ ~</w:t>
+        <w:t xml:space="preserve">H  ~ ~ ~ ~ T ~ ~ ~ ~ ~     H  ~ ~ ~ ~ ~ ~ O ~ ~ ~</w:t>
       </w:r>
     </w:p>
     <w:p>
@@ -1981,23 +1731,13 @@
         <w:spacing w:line="240" w:lineRule="auto"/>
         <w:ind w:left="200"/>
       </w:pPr>
-      <w:proofErr w:type="gramStart"/>
       <w:r>
         <w:rPr>
           <w:rFonts w:ascii="Consolas" w:eastAsia="Consolas" w:hAnsi="Consolas" w:cs="Consolas"/>
           <w:sz w:val="17"/>
           <w:szCs w:val="17"/>
         </w:rPr>
-        <w:t>I  ~</w:t>
-      </w:r>
-      <w:proofErr w:type="gramEnd"/>
-      <w:r>
-        <w:rPr>
-          <w:rFonts w:ascii="Consolas" w:eastAsia="Consolas" w:hAnsi="Consolas" w:cs="Consolas"/>
-          <w:sz w:val="17"/>
-          <w:szCs w:val="17"/>
-        </w:rPr>
-        <w:t xml:space="preserve"> ~ ~ ~ ~ B ~ ~ ~ ~     I  ~ ~ ~ ~ ~ ~ ~ ~ ~ ~</w:t>
+        <w:t xml:space="preserve">I  ~ ~ ~ ~ ~ B ~ ~ ~ ~     I  ~ ~ ~ ~ ~ ~ ~ ~ ~ ~</w:t>
       </w:r>
     </w:p>
     <w:p>
@@ -2011,23 +1751,13 @@
         <w:spacing w:line="240" w:lineRule="auto"/>
         <w:ind w:left="200"/>
       </w:pPr>
-      <w:proofErr w:type="gramStart"/>
       <w:r>
         <w:rPr>
           <w:rFonts w:ascii="Consolas" w:eastAsia="Consolas" w:hAnsi="Consolas" w:cs="Consolas"/>
           <w:sz w:val="17"/>
           <w:szCs w:val="17"/>
         </w:rPr>
-        <w:t>J  ~</w:t>
-      </w:r>
-      <w:proofErr w:type="gramEnd"/>
-      <w:r>
-        <w:rPr>
-          <w:rFonts w:ascii="Consolas" w:eastAsia="Consolas" w:hAnsi="Consolas" w:cs="Consolas"/>
-          <w:sz w:val="17"/>
-          <w:szCs w:val="17"/>
-        </w:rPr>
-        <w:t xml:space="preserve"> ~ ~ ~ ~ B ~ ~ ~ T     J  ~ ~ ~ ~ ~ ~ ~ ~ ~ ~</w:t>
+        <w:t xml:space="preserve">J  ~ ~ ~ ~ ~ B ~ ~ ~ T     J  ~ ~ ~ ~ ~ ~ ~ ~ ~ ~</w:t>
       </w:r>
     </w:p>
     <w:p>
@@ -2067,25 +1797,7 @@
           <w:sz w:val="17"/>
           <w:szCs w:val="17"/>
         </w:rPr>
-        <w:t xml:space="preserve">¿Dónde </w:t>
-      </w:r>
-      <w:proofErr w:type="spellStart"/>
-      <w:r>
-        <w:rPr>
-          <w:rFonts w:ascii="Consolas" w:eastAsia="Consolas" w:hAnsi="Consolas" w:cs="Consolas"/>
-          <w:sz w:val="17"/>
-          <w:szCs w:val="17"/>
-        </w:rPr>
-        <w:t>tirás</w:t>
-      </w:r>
-      <w:proofErr w:type="spellEnd"/>
-      <w:r>
-        <w:rPr>
-          <w:rFonts w:ascii="Consolas" w:eastAsia="Consolas" w:hAnsi="Consolas" w:cs="Consolas"/>
-          <w:sz w:val="17"/>
-          <w:szCs w:val="17"/>
-        </w:rPr>
-        <w:t xml:space="preserve"> la bomba? E8</w:t>
+        <w:t xml:space="preserve">¿Dónde tirás la bomba? E8</w:t>
       </w:r>
     </w:p>
     <w:p>
@@ -2105,7 +1817,7 @@
           <w:sz w:val="17"/>
           <w:szCs w:val="17"/>
         </w:rPr>
-        <w:t>¡Trampolín! La bomba rebota y cae en TU tablero, en E8.</w:t>
+        <w:t>¡Trampolín! La bomba rebota y cae en TU tablero, en una casilla al azar: D8.</w:t>
       </w:r>
     </w:p>
     <w:p>
@@ -2139,41 +1851,13 @@
         <w:spacing w:line="240" w:lineRule="auto"/>
         <w:ind w:left="200"/>
       </w:pPr>
-      <w:proofErr w:type="spellStart"/>
       <w:r>
         <w:rPr>
           <w:rFonts w:ascii="Consolas" w:eastAsia="Consolas" w:hAnsi="Consolas" w:cs="Consolas"/>
           <w:sz w:val="17"/>
           <w:szCs w:val="17"/>
         </w:rPr>
-        <w:t>Presioná</w:t>
-      </w:r>
-      <w:proofErr w:type="spellEnd"/>
-      <w:r>
-        <w:rPr>
-          <w:rFonts w:ascii="Consolas" w:eastAsia="Consolas" w:hAnsi="Consolas" w:cs="Consolas"/>
-          <w:sz w:val="17"/>
-          <w:szCs w:val="17"/>
-        </w:rPr>
-        <w:t xml:space="preserve"> </w:t>
-      </w:r>
-      <w:proofErr w:type="spellStart"/>
-      <w:r>
-        <w:rPr>
-          <w:rFonts w:ascii="Consolas" w:eastAsia="Consolas" w:hAnsi="Consolas" w:cs="Consolas"/>
-          <w:sz w:val="17"/>
-          <w:szCs w:val="17"/>
-        </w:rPr>
-        <w:t>Enter</w:t>
-      </w:r>
-      <w:proofErr w:type="spellEnd"/>
-      <w:r>
-        <w:rPr>
-          <w:rFonts w:ascii="Consolas" w:eastAsia="Consolas" w:hAnsi="Consolas" w:cs="Consolas"/>
-          <w:sz w:val="17"/>
-          <w:szCs w:val="17"/>
-        </w:rPr>
-        <w:t xml:space="preserve"> para pasarle el turno a Martina...</w:t>
+        <w:t xml:space="preserve">Presioná Enter para pasarle el turno a Martina...</w:t>
       </w:r>
     </w:p>
     <w:p>
@@ -2217,15 +1901,7 @@
         <w:spacing w:after="80"/>
       </w:pPr>
       <w:r>
-        <w:t xml:space="preserve">El tablero es de 10 x 10: filas A </w:t>
-      </w:r>
-      <w:proofErr w:type="spellStart"/>
-      <w:r>
-        <w:t>a</w:t>
-      </w:r>
-      <w:proofErr w:type="spellEnd"/>
-      <w:r>
-        <w:t xml:space="preserve"> J, columnas 1 a 10.</w:t>
+        <w:t xml:space="preserve">El tablero es de 10 x 10: filas A a J, columnas 1 a 10.</w:t>
       </w:r>
     </w:p>
     <w:p>
@@ -2425,10 +2101,7 @@
         <w:spacing w:after="80"/>
       </w:pPr>
       <w:r>
-        <w:t xml:space="preserve">Si la bomba cae en un trampolín, rebota y cae en el tablero de quien la tiró, </w:t>
-      </w:r>
-      <w:r>
-        <w:t>en una casilla random siempre y cuando no se haya disparado ahí anteriormente</w:t>
+        <w:t>Si la bomba cae en un trampolín, rebota y cae en el tablero de quien la tiró, en una casilla al azar donde todavía no haya caído ninguna bomba.</w:t>
       </w:r>
     </w:p>
     <w:p>
@@ -2480,16 +2153,8 @@
         <w:spacing w:after="80"/>
       </w:pPr>
       <w:r>
-        <w:t xml:space="preserve">Cae en un trampolín tuyo: la bomba </w:t>
-      </w:r>
-      <w:r>
-        <w:t xml:space="preserve">vuelve a rebotar en un trampolín y la bomba es dirigida nuevamente hacia el otro tablero. Este ciclo se repite hasta que no caiga en otro </w:t>
-      </w:r>
-      <w:proofErr w:type="spellStart"/>
-      <w:r>
-        <w:t>trampolin</w:t>
-      </w:r>
-      <w:proofErr w:type="spellEnd"/>
+        <w:t>Cae en un trampolín tuyo: la bomba vuelve a rebotar y cae en el tablero del rival, también en una casilla al azar donde todavía no haya caído ninguna bomba. Ahí puede caer en agua, tocar o hundir un barco del rival, o caer en otro trampolín y rebotar de nuevo hacia tu tablero. El ciclo se repite hasta que la bomba caiga en una casilla que no sea un trampolín.</w:t>
+      </w:r>
     </w:p>
     <w:p>
       <w:pPr>
@@ -2524,7 +2189,7 @@
         <w:spacing w:after="80"/>
       </w:pPr>
       <w:r>
-        <w:t>El juego siempre le avisa al que tiró que la bomba rebotó y qué pasó en su tablero.</w:t>
+        <w:t>El juego siempre le avisa al que tiró que la bomba rebotó, en qué casilla cayó en cada rebote y qué pasó ahí.</w:t>
       </w:r>
     </w:p>
     <w:p>

</xml_diff>

<commit_message>
Vuelve el TPO a la versión anterior al PR #2
Deshace los cambios del PR #2 (documento técnico, manual y diagramas).
No toca el código de TPO/BATALLA_NAVAL.

Co-Authored-By: Claude Opus 5.5 <noreply@anthropic.com>
Claude-Session: https://claude.ai/code/session_01YcNnhzVZgkJypRptvKEgbn
</commit_message>
<xml_diff>
--- a/TPO/Manual_Batalla_Naval_con_Trampolines.docx
+++ b/TPO/Manual_Batalla_Naval_con_Trampolines.docx
@@ -73,8 +73,72 @@
         <w:rPr>
           <w:color w:val="5B6770"/>
         </w:rPr>
-        <w:t xml:space="preserve">Santiago Terminiello, Nahuel Mioni, Emanuel Paoloni, Matias Llanos y Joaquin Valdettaro</w:t>
-      </w:r>
+        <w:t xml:space="preserve">Santiago </w:t>
+      </w:r>
+      <w:proofErr w:type="spellStart"/>
+      <w:r>
+        <w:rPr>
+          <w:color w:val="5B6770"/>
+        </w:rPr>
+        <w:t>Terminiello</w:t>
+      </w:r>
+      <w:proofErr w:type="spellEnd"/>
+      <w:r>
+        <w:rPr>
+          <w:color w:val="5B6770"/>
+        </w:rPr>
+        <w:t xml:space="preserve">, Nahuel </w:t>
+      </w:r>
+      <w:proofErr w:type="spellStart"/>
+      <w:r>
+        <w:rPr>
+          <w:color w:val="5B6770"/>
+        </w:rPr>
+        <w:t>Mioni</w:t>
+      </w:r>
+      <w:proofErr w:type="spellEnd"/>
+      <w:r>
+        <w:rPr>
+          <w:color w:val="5B6770"/>
+        </w:rPr>
+        <w:t xml:space="preserve">, Emanuel </w:t>
+      </w:r>
+      <w:proofErr w:type="spellStart"/>
+      <w:r>
+        <w:rPr>
+          <w:color w:val="5B6770"/>
+        </w:rPr>
+        <w:t>Paoloni</w:t>
+      </w:r>
+      <w:proofErr w:type="spellEnd"/>
+      <w:r>
+        <w:rPr>
+          <w:color w:val="5B6770"/>
+        </w:rPr>
+        <w:t xml:space="preserve">, Matias Llanos y </w:t>
+      </w:r>
+      <w:proofErr w:type="spellStart"/>
+      <w:r>
+        <w:rPr>
+          <w:color w:val="5B6770"/>
+        </w:rPr>
+        <w:t>Joaquin</w:t>
+      </w:r>
+      <w:proofErr w:type="spellEnd"/>
+      <w:r>
+        <w:rPr>
+          <w:color w:val="5B6770"/>
+        </w:rPr>
+        <w:t xml:space="preserve"> </w:t>
+      </w:r>
+      <w:proofErr w:type="spellStart"/>
+      <w:r>
+        <w:rPr>
+          <w:color w:val="5B6770"/>
+        </w:rPr>
+        <w:t>Valdettaro</w:t>
+      </w:r>
+      <w:proofErr w:type="spellEnd"/>
     </w:p>
     <w:p>
       <w:pPr>
@@ -590,7 +654,15 @@
         <w:t>A</w:t>
       </w:r>
       <w:r>
-        <w:t xml:space="preserve"> a la </w:t>
+        <w:t xml:space="preserve"> </w:t>
+      </w:r>
+      <w:proofErr w:type="spellStart"/>
+      <w:r>
+        <w:t>a</w:t>
+      </w:r>
+      <w:proofErr w:type="spellEnd"/>
+      <w:r>
+        <w:t xml:space="preserve"> la </w:t>
       </w:r>
       <w:r>
         <w:rPr>
@@ -767,7 +839,15 @@
         <w:spacing w:after="80"/>
       </w:pPr>
       <w:r>
-        <w:t xml:space="preserve">Escribís la casilla del tablero rival donde tirás la bomba.</w:t>
+        <w:t xml:space="preserve">Escribís la casilla del tablero rival donde </w:t>
+      </w:r>
+      <w:proofErr w:type="spellStart"/>
+      <w:r>
+        <w:t>tirás</w:t>
+      </w:r>
+      <w:proofErr w:type="spellEnd"/>
+      <w:r>
+        <w:t xml:space="preserve"> la bomba.</w:t>
       </w:r>
     </w:p>
     <w:p>
@@ -833,7 +913,7 @@
         <w:spacing w:after="80"/>
       </w:pPr>
       <w:r>
-        <w:t>Si fue trampolín, la bomba cae en tu propio tablero, en una casilla al azar donde todavía no haya caído ninguna bomba, y el juego te dice dónde cayó y qué pasó ahí. Si ahí hay un trampolín tuyo, la bomba vuelve a rebotar (ver la regla 10).</w:t>
+        <w:t>Si fue trampolín, la bomba cae en tu propio tablero, en la misma casilla, y el juego te dice qué pasó ahí.</w:t>
       </w:r>
     </w:p>
     <w:p>
@@ -845,8 +925,21 @@
         </w:numPr>
         <w:spacing w:after="80"/>
       </w:pPr>
-      <w:r>
-        <w:t xml:space="preserve">Presionás Enter, se limpia la pantalla y le toca al otro jugador.</w:t>
+      <w:proofErr w:type="spellStart"/>
+      <w:r>
+        <w:t>Presionás</w:t>
+      </w:r>
+      <w:proofErr w:type="spellEnd"/>
+      <w:r>
+        <w:t xml:space="preserve"> </w:t>
+      </w:r>
+      <w:proofErr w:type="spellStart"/>
+      <w:r>
+        <w:t>Enter</w:t>
+      </w:r>
+      <w:proofErr w:type="spellEnd"/>
+      <w:r>
+        <w:t>, se limpia la pantalla y le toca al otro jugador.</w:t>
       </w:r>
     </w:p>
     <w:p>
@@ -1032,8 +1125,13 @@
           </w:tcPr>
           <w:p>
             <w:r>
-              <w:t xml:space="preserve">Agua, o una casilla que todavía no conocés</w:t>
+              <w:t xml:space="preserve">Agua, o una casilla que todavía no </w:t>
             </w:r>
+            <w:proofErr w:type="spellStart"/>
+            <w:r>
+              <w:t>conocés</w:t>
+            </w:r>
+            <w:proofErr w:type="spellEnd"/>
           </w:p>
         </w:tc>
         <w:tc>
@@ -1537,7 +1635,25 @@
           <w:sz w:val="17"/>
           <w:szCs w:val="17"/>
         </w:rPr>
-        <w:t xml:space="preserve">TU TABLERO                 TABLERO DE MARTINA</w:t>
+        <w:t xml:space="preserve">TU TABLERO                 </w:t>
+      </w:r>
+      <w:proofErr w:type="spellStart"/>
+      <w:r>
+        <w:rPr>
+          <w:rFonts w:ascii="Consolas" w:eastAsia="Consolas" w:hAnsi="Consolas" w:cs="Consolas"/>
+          <w:sz w:val="17"/>
+          <w:szCs w:val="17"/>
+        </w:rPr>
+        <w:t>TABLERO</w:t>
+      </w:r>
+      <w:proofErr w:type="spellEnd"/>
+      <w:r>
+        <w:rPr>
+          <w:rFonts w:ascii="Consolas" w:eastAsia="Consolas" w:hAnsi="Consolas" w:cs="Consolas"/>
+          <w:sz w:val="17"/>
+          <w:szCs w:val="17"/>
+        </w:rPr>
+        <w:t xml:space="preserve"> DE MARTINA</w:t>
       </w:r>
     </w:p>
     <w:p>
@@ -1571,13 +1687,41 @@
         <w:spacing w:line="240" w:lineRule="auto"/>
         <w:ind w:left="200"/>
       </w:pPr>
-      <w:r>
-        <w:rPr>
-          <w:rFonts w:ascii="Consolas" w:eastAsia="Consolas" w:hAnsi="Consolas" w:cs="Consolas"/>
-          <w:sz w:val="17"/>
-          <w:szCs w:val="17"/>
-        </w:rPr>
-        <w:t xml:space="preserve">A  ~ B X B B ~ ~ ~ ~ ~     A  ~ ~ ~ ~ ~ ~ ~ ~ ~ ~</w:t>
+      <w:proofErr w:type="gramStart"/>
+      <w:r>
+        <w:rPr>
+          <w:rFonts w:ascii="Consolas" w:eastAsia="Consolas" w:hAnsi="Consolas" w:cs="Consolas"/>
+          <w:sz w:val="17"/>
+          <w:szCs w:val="17"/>
+        </w:rPr>
+        <w:t>A  ~</w:t>
+      </w:r>
+      <w:proofErr w:type="gramEnd"/>
+      <w:r>
+        <w:rPr>
+          <w:rFonts w:ascii="Consolas" w:eastAsia="Consolas" w:hAnsi="Consolas" w:cs="Consolas"/>
+          <w:sz w:val="17"/>
+          <w:szCs w:val="17"/>
+        </w:rPr>
+        <w:t xml:space="preserve"> B X B </w:t>
+      </w:r>
+      <w:proofErr w:type="spellStart"/>
+      <w:r>
+        <w:rPr>
+          <w:rFonts w:ascii="Consolas" w:eastAsia="Consolas" w:hAnsi="Consolas" w:cs="Consolas"/>
+          <w:sz w:val="17"/>
+          <w:szCs w:val="17"/>
+        </w:rPr>
+        <w:t>B</w:t>
+      </w:r>
+      <w:proofErr w:type="spellEnd"/>
+      <w:r>
+        <w:rPr>
+          <w:rFonts w:ascii="Consolas" w:eastAsia="Consolas" w:hAnsi="Consolas" w:cs="Consolas"/>
+          <w:sz w:val="17"/>
+          <w:szCs w:val="17"/>
+        </w:rPr>
+        <w:t xml:space="preserve"> ~ ~ ~ ~ ~     A  ~ ~ ~ ~ ~ ~ ~ ~ ~ ~</w:t>
       </w:r>
     </w:p>
     <w:p>
@@ -1591,13 +1735,41 @@
         <w:spacing w:line="240" w:lineRule="auto"/>
         <w:ind w:left="200"/>
       </w:pPr>
-      <w:r>
-        <w:rPr>
-          <w:rFonts w:ascii="Consolas" w:eastAsia="Consolas" w:hAnsi="Consolas" w:cs="Consolas"/>
-          <w:sz w:val="17"/>
-          <w:szCs w:val="17"/>
-        </w:rPr>
-        <w:t xml:space="preserve">B  ~ ~ ~ ~ ~ ~ ~ ~ T ~     B  ~ X X ~ ~ ~ ~ ~ ~ ~</w:t>
+      <w:proofErr w:type="gramStart"/>
+      <w:r>
+        <w:rPr>
+          <w:rFonts w:ascii="Consolas" w:eastAsia="Consolas" w:hAnsi="Consolas" w:cs="Consolas"/>
+          <w:sz w:val="17"/>
+          <w:szCs w:val="17"/>
+        </w:rPr>
+        <w:t>B  ~</w:t>
+      </w:r>
+      <w:proofErr w:type="gramEnd"/>
+      <w:r>
+        <w:rPr>
+          <w:rFonts w:ascii="Consolas" w:eastAsia="Consolas" w:hAnsi="Consolas" w:cs="Consolas"/>
+          <w:sz w:val="17"/>
+          <w:szCs w:val="17"/>
+        </w:rPr>
+        <w:t xml:space="preserve"> ~ ~ ~ ~ ~ ~ ~ T ~     B  ~ X </w:t>
+      </w:r>
+      <w:proofErr w:type="spellStart"/>
+      <w:r>
+        <w:rPr>
+          <w:rFonts w:ascii="Consolas" w:eastAsia="Consolas" w:hAnsi="Consolas" w:cs="Consolas"/>
+          <w:sz w:val="17"/>
+          <w:szCs w:val="17"/>
+        </w:rPr>
+        <w:t>X</w:t>
+      </w:r>
+      <w:proofErr w:type="spellEnd"/>
+      <w:r>
+        <w:rPr>
+          <w:rFonts w:ascii="Consolas" w:eastAsia="Consolas" w:hAnsi="Consolas" w:cs="Consolas"/>
+          <w:sz w:val="17"/>
+          <w:szCs w:val="17"/>
+        </w:rPr>
+        <w:t xml:space="preserve"> ~ ~ ~ ~ ~ ~ ~</w:t>
       </w:r>
     </w:p>
     <w:p>
@@ -1611,13 +1783,23 @@
         <w:spacing w:line="240" w:lineRule="auto"/>
         <w:ind w:left="200"/>
       </w:pPr>
-      <w:r>
-        <w:rPr>
-          <w:rFonts w:ascii="Consolas" w:eastAsia="Consolas" w:hAnsi="Consolas" w:cs="Consolas"/>
-          <w:sz w:val="17"/>
-          <w:szCs w:val="17"/>
-        </w:rPr>
-        <w:t xml:space="preserve">C  ~ ~ ~ ~ ~ ~ ~ B ~ ~     C  ~ ~ ~ ~ ~ ~ ~ ~ ~ ~</w:t>
+      <w:proofErr w:type="gramStart"/>
+      <w:r>
+        <w:rPr>
+          <w:rFonts w:ascii="Consolas" w:eastAsia="Consolas" w:hAnsi="Consolas" w:cs="Consolas"/>
+          <w:sz w:val="17"/>
+          <w:szCs w:val="17"/>
+        </w:rPr>
+        <w:t>C  ~</w:t>
+      </w:r>
+      <w:proofErr w:type="gramEnd"/>
+      <w:r>
+        <w:rPr>
+          <w:rFonts w:ascii="Consolas" w:eastAsia="Consolas" w:hAnsi="Consolas" w:cs="Consolas"/>
+          <w:sz w:val="17"/>
+          <w:szCs w:val="17"/>
+        </w:rPr>
+        <w:t xml:space="preserve"> ~ ~ ~ ~ ~ ~ B ~ ~     C  ~ ~ ~ ~ ~ ~ ~ ~ ~ ~</w:t>
       </w:r>
     </w:p>
     <w:p>
@@ -1631,13 +1813,23 @@
         <w:spacing w:line="240" w:lineRule="auto"/>
         <w:ind w:left="200"/>
       </w:pPr>
-      <w:r>
-        <w:rPr>
-          <w:rFonts w:ascii="Consolas" w:eastAsia="Consolas" w:hAnsi="Consolas" w:cs="Consolas"/>
-          <w:sz w:val="17"/>
-          <w:szCs w:val="17"/>
-        </w:rPr>
-        <w:t xml:space="preserve">D  ~ ~ ~ ~ ~ ~ ~ B ~ ~     D  ~ ~ ~ O ~ ~ ~ ~ ~ ~</w:t>
+      <w:proofErr w:type="gramStart"/>
+      <w:r>
+        <w:rPr>
+          <w:rFonts w:ascii="Consolas" w:eastAsia="Consolas" w:hAnsi="Consolas" w:cs="Consolas"/>
+          <w:sz w:val="17"/>
+          <w:szCs w:val="17"/>
+        </w:rPr>
+        <w:t>D  ~</w:t>
+      </w:r>
+      <w:proofErr w:type="gramEnd"/>
+      <w:r>
+        <w:rPr>
+          <w:rFonts w:ascii="Consolas" w:eastAsia="Consolas" w:hAnsi="Consolas" w:cs="Consolas"/>
+          <w:sz w:val="17"/>
+          <w:szCs w:val="17"/>
+        </w:rPr>
+        <w:t xml:space="preserve"> ~ ~ ~ ~ ~ ~ B ~ ~     D  ~ ~ ~ O ~ ~ ~ ~ ~ ~</w:t>
       </w:r>
     </w:p>
     <w:p>
@@ -1651,13 +1843,23 @@
         <w:spacing w:line="240" w:lineRule="auto"/>
         <w:ind w:left="200"/>
       </w:pPr>
-      <w:r>
-        <w:rPr>
-          <w:rFonts w:ascii="Consolas" w:eastAsia="Consolas" w:hAnsi="Consolas" w:cs="Consolas"/>
-          <w:sz w:val="17"/>
-          <w:szCs w:val="17"/>
-        </w:rPr>
-        <w:t xml:space="preserve">E  ~ ~ R ~ ~ ~ ~ B ~ ~     E  ~ ~ ~ ~ ~ ~ ~ ~ ~ ~</w:t>
+      <w:proofErr w:type="gramStart"/>
+      <w:r>
+        <w:rPr>
+          <w:rFonts w:ascii="Consolas" w:eastAsia="Consolas" w:hAnsi="Consolas" w:cs="Consolas"/>
+          <w:sz w:val="17"/>
+          <w:szCs w:val="17"/>
+        </w:rPr>
+        <w:t>E  ~</w:t>
+      </w:r>
+      <w:proofErr w:type="gramEnd"/>
+      <w:r>
+        <w:rPr>
+          <w:rFonts w:ascii="Consolas" w:eastAsia="Consolas" w:hAnsi="Consolas" w:cs="Consolas"/>
+          <w:sz w:val="17"/>
+          <w:szCs w:val="17"/>
+        </w:rPr>
+        <w:t xml:space="preserve"> ~ R ~ ~ ~ ~ B ~ ~     E  ~ ~ ~ ~ ~ ~ ~ ~ ~ ~</w:t>
       </w:r>
     </w:p>
     <w:p>
@@ -1671,13 +1873,23 @@
         <w:spacing w:line="240" w:lineRule="auto"/>
         <w:ind w:left="200"/>
       </w:pPr>
-      <w:r>
-        <w:rPr>
-          <w:rFonts w:ascii="Consolas" w:eastAsia="Consolas" w:hAnsi="Consolas" w:cs="Consolas"/>
-          <w:sz w:val="17"/>
-          <w:szCs w:val="17"/>
-        </w:rPr>
-        <w:t xml:space="preserve">F  ~ ~ ~ ~ ~ O ~ ~ ~ ~     F  ~ ~ ~ ~ ~ ~ ~ ~ R ~</w:t>
+      <w:proofErr w:type="gramStart"/>
+      <w:r>
+        <w:rPr>
+          <w:rFonts w:ascii="Consolas" w:eastAsia="Consolas" w:hAnsi="Consolas" w:cs="Consolas"/>
+          <w:sz w:val="17"/>
+          <w:szCs w:val="17"/>
+        </w:rPr>
+        <w:t>F  ~</w:t>
+      </w:r>
+      <w:proofErr w:type="gramEnd"/>
+      <w:r>
+        <w:rPr>
+          <w:rFonts w:ascii="Consolas" w:eastAsia="Consolas" w:hAnsi="Consolas" w:cs="Consolas"/>
+          <w:sz w:val="17"/>
+          <w:szCs w:val="17"/>
+        </w:rPr>
+        <w:t xml:space="preserve"> ~ ~ ~ ~ O ~ ~ ~ ~     F  ~ ~ ~ ~ ~ ~ ~ ~ R ~</w:t>
       </w:r>
     </w:p>
     <w:p>
@@ -1691,13 +1903,41 @@
         <w:spacing w:line="240" w:lineRule="auto"/>
         <w:ind w:left="200"/>
       </w:pPr>
-      <w:r>
-        <w:rPr>
-          <w:rFonts w:ascii="Consolas" w:eastAsia="Consolas" w:hAnsi="Consolas" w:cs="Consolas"/>
-          <w:sz w:val="17"/>
-          <w:szCs w:val="17"/>
-        </w:rPr>
-        <w:t xml:space="preserve">G  B B ~ ~ ~ ~ ~ ~ ~ ~     G  ~ ~ ~ ~ ~ ~ ~ ~ ~ ~</w:t>
+      <w:proofErr w:type="gramStart"/>
+      <w:r>
+        <w:rPr>
+          <w:rFonts w:ascii="Consolas" w:eastAsia="Consolas" w:hAnsi="Consolas" w:cs="Consolas"/>
+          <w:sz w:val="17"/>
+          <w:szCs w:val="17"/>
+        </w:rPr>
+        <w:t>G  B</w:t>
+      </w:r>
+      <w:proofErr w:type="gramEnd"/>
+      <w:r>
+        <w:rPr>
+          <w:rFonts w:ascii="Consolas" w:eastAsia="Consolas" w:hAnsi="Consolas" w:cs="Consolas"/>
+          <w:sz w:val="17"/>
+          <w:szCs w:val="17"/>
+        </w:rPr>
+        <w:t xml:space="preserve"> </w:t>
+      </w:r>
+      <w:proofErr w:type="spellStart"/>
+      <w:r>
+        <w:rPr>
+          <w:rFonts w:ascii="Consolas" w:eastAsia="Consolas" w:hAnsi="Consolas" w:cs="Consolas"/>
+          <w:sz w:val="17"/>
+          <w:szCs w:val="17"/>
+        </w:rPr>
+        <w:t>B</w:t>
+      </w:r>
+      <w:proofErr w:type="spellEnd"/>
+      <w:r>
+        <w:rPr>
+          <w:rFonts w:ascii="Consolas" w:eastAsia="Consolas" w:hAnsi="Consolas" w:cs="Consolas"/>
+          <w:sz w:val="17"/>
+          <w:szCs w:val="17"/>
+        </w:rPr>
+        <w:t xml:space="preserve"> ~ ~ ~ ~ ~ ~ ~ ~     G  ~ ~ ~ ~ ~ ~ ~ ~ ~ ~</w:t>
       </w:r>
     </w:p>
     <w:p>
@@ -1711,13 +1951,23 @@
         <w:spacing w:line="240" w:lineRule="auto"/>
         <w:ind w:left="200"/>
       </w:pPr>
-      <w:r>
-        <w:rPr>
-          <w:rFonts w:ascii="Consolas" w:eastAsia="Consolas" w:hAnsi="Consolas" w:cs="Consolas"/>
-          <w:sz w:val="17"/>
-          <w:szCs w:val="17"/>
-        </w:rPr>
-        <w:t xml:space="preserve">H  ~ ~ ~ ~ T ~ ~ ~ ~ ~     H  ~ ~ ~ ~ ~ ~ O ~ ~ ~</w:t>
+      <w:proofErr w:type="gramStart"/>
+      <w:r>
+        <w:rPr>
+          <w:rFonts w:ascii="Consolas" w:eastAsia="Consolas" w:hAnsi="Consolas" w:cs="Consolas"/>
+          <w:sz w:val="17"/>
+          <w:szCs w:val="17"/>
+        </w:rPr>
+        <w:t>H  ~</w:t>
+      </w:r>
+      <w:proofErr w:type="gramEnd"/>
+      <w:r>
+        <w:rPr>
+          <w:rFonts w:ascii="Consolas" w:eastAsia="Consolas" w:hAnsi="Consolas" w:cs="Consolas"/>
+          <w:sz w:val="17"/>
+          <w:szCs w:val="17"/>
+        </w:rPr>
+        <w:t xml:space="preserve"> ~ ~ ~ T ~ ~ ~ ~ ~     H  ~ ~ ~ ~ ~ ~ O ~ ~ ~</w:t>
       </w:r>
     </w:p>
     <w:p>
@@ -1731,13 +1981,23 @@
         <w:spacing w:line="240" w:lineRule="auto"/>
         <w:ind w:left="200"/>
       </w:pPr>
-      <w:r>
-        <w:rPr>
-          <w:rFonts w:ascii="Consolas" w:eastAsia="Consolas" w:hAnsi="Consolas" w:cs="Consolas"/>
-          <w:sz w:val="17"/>
-          <w:szCs w:val="17"/>
-        </w:rPr>
-        <w:t xml:space="preserve">I  ~ ~ ~ ~ ~ B ~ ~ ~ ~     I  ~ ~ ~ ~ ~ ~ ~ ~ ~ ~</w:t>
+      <w:proofErr w:type="gramStart"/>
+      <w:r>
+        <w:rPr>
+          <w:rFonts w:ascii="Consolas" w:eastAsia="Consolas" w:hAnsi="Consolas" w:cs="Consolas"/>
+          <w:sz w:val="17"/>
+          <w:szCs w:val="17"/>
+        </w:rPr>
+        <w:t>I  ~</w:t>
+      </w:r>
+      <w:proofErr w:type="gramEnd"/>
+      <w:r>
+        <w:rPr>
+          <w:rFonts w:ascii="Consolas" w:eastAsia="Consolas" w:hAnsi="Consolas" w:cs="Consolas"/>
+          <w:sz w:val="17"/>
+          <w:szCs w:val="17"/>
+        </w:rPr>
+        <w:t xml:space="preserve"> ~ ~ ~ ~ B ~ ~ ~ ~     I  ~ ~ ~ ~ ~ ~ ~ ~ ~ ~</w:t>
       </w:r>
     </w:p>
     <w:p>
@@ -1751,13 +2011,23 @@
         <w:spacing w:line="240" w:lineRule="auto"/>
         <w:ind w:left="200"/>
       </w:pPr>
-      <w:r>
-        <w:rPr>
-          <w:rFonts w:ascii="Consolas" w:eastAsia="Consolas" w:hAnsi="Consolas" w:cs="Consolas"/>
-          <w:sz w:val="17"/>
-          <w:szCs w:val="17"/>
-        </w:rPr>
-        <w:t xml:space="preserve">J  ~ ~ ~ ~ ~ B ~ ~ ~ T     J  ~ ~ ~ ~ ~ ~ ~ ~ ~ ~</w:t>
+      <w:proofErr w:type="gramStart"/>
+      <w:r>
+        <w:rPr>
+          <w:rFonts w:ascii="Consolas" w:eastAsia="Consolas" w:hAnsi="Consolas" w:cs="Consolas"/>
+          <w:sz w:val="17"/>
+          <w:szCs w:val="17"/>
+        </w:rPr>
+        <w:t>J  ~</w:t>
+      </w:r>
+      <w:proofErr w:type="gramEnd"/>
+      <w:r>
+        <w:rPr>
+          <w:rFonts w:ascii="Consolas" w:eastAsia="Consolas" w:hAnsi="Consolas" w:cs="Consolas"/>
+          <w:sz w:val="17"/>
+          <w:szCs w:val="17"/>
+        </w:rPr>
+        <w:t xml:space="preserve"> ~ ~ ~ ~ B ~ ~ ~ T     J  ~ ~ ~ ~ ~ ~ ~ ~ ~ ~</w:t>
       </w:r>
     </w:p>
     <w:p>
@@ -1797,7 +2067,25 @@
           <w:sz w:val="17"/>
           <w:szCs w:val="17"/>
         </w:rPr>
-        <w:t xml:space="preserve">¿Dónde tirás la bomba? E8</w:t>
+        <w:t xml:space="preserve">¿Dónde </w:t>
+      </w:r>
+      <w:proofErr w:type="spellStart"/>
+      <w:r>
+        <w:rPr>
+          <w:rFonts w:ascii="Consolas" w:eastAsia="Consolas" w:hAnsi="Consolas" w:cs="Consolas"/>
+          <w:sz w:val="17"/>
+          <w:szCs w:val="17"/>
+        </w:rPr>
+        <w:t>tirás</w:t>
+      </w:r>
+      <w:proofErr w:type="spellEnd"/>
+      <w:r>
+        <w:rPr>
+          <w:rFonts w:ascii="Consolas" w:eastAsia="Consolas" w:hAnsi="Consolas" w:cs="Consolas"/>
+          <w:sz w:val="17"/>
+          <w:szCs w:val="17"/>
+        </w:rPr>
+        <w:t xml:space="preserve"> la bomba? E8</w:t>
       </w:r>
     </w:p>
     <w:p>
@@ -1817,7 +2105,7 @@
           <w:sz w:val="17"/>
           <w:szCs w:val="17"/>
         </w:rPr>
-        <w:t>¡Trampolín! La bomba rebota y cae en TU tablero, en una casilla al azar: D8.</w:t>
+        <w:t>¡Trampolín! La bomba rebota y cae en TU tablero, en E8.</w:t>
       </w:r>
     </w:p>
     <w:p>
@@ -1851,13 +2139,41 @@
         <w:spacing w:line="240" w:lineRule="auto"/>
         <w:ind w:left="200"/>
       </w:pPr>
-      <w:r>
-        <w:rPr>
-          <w:rFonts w:ascii="Consolas" w:eastAsia="Consolas" w:hAnsi="Consolas" w:cs="Consolas"/>
-          <w:sz w:val="17"/>
-          <w:szCs w:val="17"/>
-        </w:rPr>
-        <w:t xml:space="preserve">Presioná Enter para pasarle el turno a Martina...</w:t>
+      <w:proofErr w:type="spellStart"/>
+      <w:r>
+        <w:rPr>
+          <w:rFonts w:ascii="Consolas" w:eastAsia="Consolas" w:hAnsi="Consolas" w:cs="Consolas"/>
+          <w:sz w:val="17"/>
+          <w:szCs w:val="17"/>
+        </w:rPr>
+        <w:t>Presioná</w:t>
+      </w:r>
+      <w:proofErr w:type="spellEnd"/>
+      <w:r>
+        <w:rPr>
+          <w:rFonts w:ascii="Consolas" w:eastAsia="Consolas" w:hAnsi="Consolas" w:cs="Consolas"/>
+          <w:sz w:val="17"/>
+          <w:szCs w:val="17"/>
+        </w:rPr>
+        <w:t xml:space="preserve"> </w:t>
+      </w:r>
+      <w:proofErr w:type="spellStart"/>
+      <w:r>
+        <w:rPr>
+          <w:rFonts w:ascii="Consolas" w:eastAsia="Consolas" w:hAnsi="Consolas" w:cs="Consolas"/>
+          <w:sz w:val="17"/>
+          <w:szCs w:val="17"/>
+        </w:rPr>
+        <w:t>Enter</w:t>
+      </w:r>
+      <w:proofErr w:type="spellEnd"/>
+      <w:r>
+        <w:rPr>
+          <w:rFonts w:ascii="Consolas" w:eastAsia="Consolas" w:hAnsi="Consolas" w:cs="Consolas"/>
+          <w:sz w:val="17"/>
+          <w:szCs w:val="17"/>
+        </w:rPr>
+        <w:t xml:space="preserve"> para pasarle el turno a Martina...</w:t>
       </w:r>
     </w:p>
     <w:p>
@@ -1901,7 +2217,15 @@
         <w:spacing w:after="80"/>
       </w:pPr>
       <w:r>
-        <w:t xml:space="preserve">El tablero es de 10 x 10: filas A a J, columnas 1 a 10.</w:t>
+        <w:t xml:space="preserve">El tablero es de 10 x 10: filas A </w:t>
+      </w:r>
+      <w:proofErr w:type="spellStart"/>
+      <w:r>
+        <w:t>a</w:t>
+      </w:r>
+      <w:proofErr w:type="spellEnd"/>
+      <w:r>
+        <w:t xml:space="preserve"> J, columnas 1 a 10.</w:t>
       </w:r>
     </w:p>
     <w:p>
@@ -2101,7 +2425,10 @@
         <w:spacing w:after="80"/>
       </w:pPr>
       <w:r>
-        <w:t>Si la bomba cae en un trampolín, rebota y cae en el tablero de quien la tiró, en una casilla al azar donde todavía no haya caído ninguna bomba.</w:t>
+        <w:t xml:space="preserve">Si la bomba cae en un trampolín, rebota y cae en el tablero de quien la tiró, </w:t>
+      </w:r>
+      <w:r>
+        <w:t>en una casilla random siempre y cuando no se haya disparado ahí anteriormente</w:t>
       </w:r>
     </w:p>
     <w:p>
@@ -2153,8 +2480,16 @@
         <w:spacing w:after="80"/>
       </w:pPr>
       <w:r>
-        <w:t>Cae en un trampolín tuyo: la bomba vuelve a rebotar y cae en el tablero del rival, también en una casilla al azar donde todavía no haya caído ninguna bomba. Ahí puede caer en agua, tocar o hundir un barco del rival, o caer en otro trampolín y rebotar de nuevo hacia tu tablero. El ciclo se repite hasta que la bomba caiga en una casilla que no sea un trampolín.</w:t>
-      </w:r>
+        <w:t xml:space="preserve">Cae en un trampolín tuyo: la bomba </w:t>
+      </w:r>
+      <w:r>
+        <w:t xml:space="preserve">vuelve a rebotar en un trampolín y la bomba es dirigida nuevamente hacia el otro tablero. Este ciclo se repite hasta que no caiga en otro </w:t>
+      </w:r>
+      <w:proofErr w:type="spellStart"/>
+      <w:r>
+        <w:t>trampolin</w:t>
+      </w:r>
+      <w:proofErr w:type="spellEnd"/>
     </w:p>
     <w:p>
       <w:pPr>
@@ -2189,7 +2524,7 @@
         <w:spacing w:after="80"/>
       </w:pPr>
       <w:r>
-        <w:t>El juego siempre le avisa al que tiró que la bomba rebotó, en qué casilla cayó en cada rebote y qué pasó ahí.</w:t>
+        <w:t>El juego siempre le avisa al que tiró que la bomba rebotó y qué pasó en su tablero.</w:t>
       </w:r>
     </w:p>
     <w:p>

</xml_diff>